<commit_message>
plot relatie variabele pars
</commit_message>
<xml_diff>
--- a/rapport_modellering_VeeST.docx
+++ b/rapport_modellering_VeeST.docx
@@ -16,7 +16,7 @@
         <w:pStyle w:val="Kop1"/>
       </w:pPr>
       <w:r>
-        <w:t xml:space="preserve">1. Inleiding</w:t>
+        <w:t xml:space="preserve">Inleiding</w:t>
       </w:r>
     </w:p>
     <w:p>
@@ -42,7 +42,7 @@
         <w:pStyle w:val="Kop1"/>
       </w:pPr>
       <w:r>
-        <w:t xml:space="preserve">2. Methoden</w:t>
+        <w:t xml:space="preserve">Methoden</w:t>
       </w:r>
     </w:p>
     <w:bookmarkStart w:id="32" w:name="data-en-predictoren"/>
@@ -51,7 +51,7 @@
         <w:pStyle w:val="Kop2"/>
       </w:pPr>
       <w:r>
-        <w:t xml:space="preserve">2.1 Data en predictoren</w:t>
+        <w:t xml:space="preserve">Data en predictoren</w:t>
       </w:r>
     </w:p>
     <w:p>
@@ -670,7 +670,7 @@
         <w:pStyle w:val="Kop3"/>
       </w:pPr>
       <w:r>
-        <w:t xml:space="preserve">2.1.1 Toegepaste datatransformaties of standaardisaties</w:t>
+        <w:t xml:space="preserve">Toegepaste datatransformaties of standaardisaties</w:t>
       </w:r>
     </w:p>
     <w:p>
@@ -1226,7 +1226,7 @@
         <w:pStyle w:val="Kop2"/>
       </w:pPr>
       <w:r>
-        <w:t xml:space="preserve">2.2 Vergelijking meting met veensloottypen</w:t>
+        <w:t xml:space="preserve">Vergelijking meting met veensloottypen</w:t>
       </w:r>
     </w:p>
     <w:p>
@@ -1302,7 +1302,7 @@
         <w:pStyle w:val="Kop2"/>
       </w:pPr>
       <w:r>
-        <w:t xml:space="preserve">2.3 XGBoost (eXtreme Gradient Boosting)</w:t>
+        <w:t xml:space="preserve">XGBoost (eXtreme Gradient Boosting)</w:t>
       </w:r>
     </w:p>
     <w:p>
@@ -1416,7 +1416,7 @@
         <w:pStyle w:val="Kop2"/>
       </w:pPr>
       <w:r>
-        <w:t xml:space="preserve">2.4 Random Forest</w:t>
+        <w:t xml:space="preserve">Random Forest</w:t>
       </w:r>
     </w:p>
     <w:p>
@@ -1585,7 +1585,7 @@
         <w:pStyle w:val="Kop2"/>
       </w:pPr>
       <w:r>
-        <w:t xml:space="preserve">2.5 Ruimtelijke cross-validatie (leave-one-waterschap-out)</w:t>
+        <w:t xml:space="preserve">Ruimtelijke cross-validatie (leave-one-waterschap-out)</w:t>
       </w:r>
     </w:p>
     <w:p>
@@ -1639,7 +1639,7 @@
         <w:pStyle w:val="Kop2"/>
       </w:pPr>
       <w:r>
-        <w:t xml:space="preserve">2.6 GAM met ruimtelijke smoothing</w:t>
+        <w:t xml:space="preserve">GAM met ruimtelijke smoothing</w:t>
       </w:r>
     </w:p>
     <w:p>
@@ -1736,7 +1736,7 @@
         <w:pStyle w:val="Kop1"/>
       </w:pPr>
       <w:r>
-        <w:t xml:space="preserve">3. Resultaten</w:t>
+        <w:t xml:space="preserve">Resultaten</w:t>
       </w:r>
     </w:p>
     <w:bookmarkStart w:id="43" w:name="Xe2588a651778c242a4874f71f81226f846eeca5"/>
@@ -1745,7 +1745,7 @@
         <w:pStyle w:val="Kop2"/>
       </w:pPr>
       <w:r>
-        <w:t xml:space="preserve">3.1 Overeenkomst veensloottypen op basis van ruimtelijke clusters vs. variabele-gebaseerde clusters</w:t>
+        <w:t xml:space="preserve">Overeenkomst veensloottypen op basis van ruimtelijke clusters vs. variabele-gebaseerde clusters</w:t>
       </w:r>
     </w:p>
     <w:p>
@@ -1912,7 +1912,7 @@
         <w:pStyle w:val="Kop2"/>
       </w:pPr>
       <w:r>
-        <w:t xml:space="preserve">3.2 Schaalbereik GIS-laag vs. veldmeting</w:t>
+        <w:t xml:space="preserve">Schaalbereik GIS-laag vs. veldmeting</w:t>
       </w:r>
     </w:p>
     <w:tbl>
@@ -2123,7 +2123,7 @@
         <w:pStyle w:val="Kop2"/>
       </w:pPr>
       <w:r>
-        <w:t xml:space="preserve">3.3 Afwijking per cluster en per gebied</w:t>
+        <w:t xml:space="preserve">Afwijking per cluster en per gebied</w:t>
       </w:r>
     </w:p>
     <w:tbl>
@@ -2260,7 +2260,7 @@
         <w:pStyle w:val="Kop2"/>
       </w:pPr>
       <w:r>
-        <w:t xml:space="preserve">3.4 Oppervlaktewaterpeilen VeeST meting tov praktijkpeilen in GIS laag (NOBV)</w:t>
+        <w:t xml:space="preserve">Oppervlaktewaterpeilen VeeST meting tov praktijkpeilen in GIS laag (NOBV)</w:t>
       </w:r>
     </w:p>
     <w:tbl>
@@ -2379,7 +2379,7 @@
         <w:pStyle w:val="Kop2"/>
       </w:pPr>
       <w:r>
-        <w:t xml:space="preserve">3.5 Modelperformantie op de testset XGBoost vs. Random Forest</w:t>
+        <w:t xml:space="preserve">Modelperformantie op de testset XGBoost vs. Random Forest</w:t>
       </w:r>
     </w:p>
     <w:tbl>
@@ -3399,7 +3399,7 @@
         <w:pStyle w:val="Kop2"/>
       </w:pPr>
       <w:r>
-        <w:t xml:space="preserve">3.6 Beste model per doelvariabele</w:t>
+        <w:t xml:space="preserve">Beste model per doelvariabele</w:t>
       </w:r>
     </w:p>
     <w:p>
@@ -3441,7 +3441,7 @@
         <w:pStyle w:val="Kop2"/>
       </w:pPr>
       <w:r>
-        <w:t xml:space="preserve">3.7 Predictorimportantie</w:t>
+        <w:t xml:space="preserve">Predictorimportantie</w:t>
       </w:r>
     </w:p>
     <w:tbl>
@@ -3649,7 +3649,7 @@
         <w:pStyle w:val="Kop2"/>
       </w:pPr>
       <w:r>
-        <w:t xml:space="preserve">3.8 Ruimtelijke cross-validatie</w:t>
+        <w:t xml:space="preserve">Ruimtelijke cross-validatie</w:t>
       </w:r>
     </w:p>
     <w:bookmarkStart w:id="84" w:name="X58b93c9934282155d7e5a3934ba7c28e41e800c"/>
@@ -3658,7 +3658,7 @@
         <w:pStyle w:val="Kop3"/>
       </w:pPr>
       <w:r>
-        <w:t xml:space="preserve">3.8.1 Welke targets generaliseren naar nieuwe gebieden?</w:t>
+        <w:t xml:space="preserve">Welke targets generaliseren naar nieuwe gebieden?</w:t>
       </w:r>
     </w:p>
     <w:tbl>
@@ -4356,7 +4356,7 @@
         <w:pStyle w:val="Kop3"/>
       </w:pPr>
       <w:r>
-        <w:t xml:space="preserve">3.8.2 HHSK als moeilijk te generaliseren gebied</w:t>
+        <w:t xml:space="preserve">HHSK als moeilijk te generaliseren gebied</w:t>
       </w:r>
     </w:p>
     <w:p>
@@ -4391,7 +4391,7 @@
         <w:pStyle w:val="Kop2"/>
       </w:pPr>
       <w:r>
-        <w:t xml:space="preserve">3.9 ALE-kantelpunten</w:t>
+        <w:t xml:space="preserve">ALE-kantelpunten</w:t>
       </w:r>
     </w:p>
     <w:p>
@@ -4530,7 +4530,7 @@
         <w:pStyle w:val="Kop1"/>
       </w:pPr>
       <w:r>
-        <w:t xml:space="preserve">4. Conclusie</w:t>
+        <w:t xml:space="preserve">Conclusie</w:t>
       </w:r>
     </w:p>
     <w:p>

</xml_diff>